<commit_message>
Inclui o link do repositório na documentação
</commit_message>
<xml_diff>
--- a/tech_challenger_3.docx
+++ b/tech_challenger_3.docx
@@ -105,6 +105,21 @@
       <w:r>
         <w:t xml:space="preserve"> no mesmo repositório. Leitores acessam a lista e o conteúdo completo dos posts. Usuários autenticados também criam, editam e excluem publicações.</w:t>
       </w:r>
+    </w:p>
+    <w:p>
+      <w:pPr/>
+      <w:r>
+        <w:t xml:space="preserve">Repositório do projeto: </w:t>
+      </w:r>
+      <w:hyperlink r:id="rId10">
+        <w:r>
+          <w:rPr>
+            <w:color w:val="0563C1"/>
+            <w:u w:val="single"/>
+          </w:rPr>
+          <w:t>https://github.com/matheushiramatsu/blog-educacional</w:t>
+        </w:r>
+      </w:hyperlink>
     </w:p>
     <w:p>
       <w:pPr>

</xml_diff>